<commit_message>
Update preliminary pages v2
Made-with: Cursor
</commit_message>
<xml_diff>
--- a/Preliminary_Pages_YONO_SBI_v2.docx
+++ b/Preliminary_Pages_YONO_SBI_v2.docx
@@ -203,6 +203,10 @@
       <w:pPr>
         <w:spacing w:after="40"/>
         <w:jc w:val="center"/>
+        <w:rPr>
+          <w:b/>
+          <w:sz w:val="26"/>
+        </w:rPr>
       </w:pPr>
       <w:r>
         <w:rPr>
@@ -210,6 +214,15 @@
           <w:sz w:val="26"/>
         </w:rPr>
         <w:t>Shalini Bharati</w:t>
+      </w:r>
+    </w:p>
+    <w:p>
+      <w:pPr>
+        <w:spacing w:after="40"/>
+        <w:jc w:val="center"/>
+      </w:pPr>
+      <w:r>
+        <w:t>Finance and HR specialization</w:t>
       </w:r>
     </w:p>
     <w:p>
@@ -251,16 +264,7 @@
           <w:b/>
           <w:sz w:val="26"/>
         </w:rPr>
-        <w:t>[Guide Name], [Designation]</w:t>
-      </w:r>
-    </w:p>
-    <w:p>
-      <w:pPr>
-        <w:spacing w:after="40"/>
-        <w:jc w:val="center"/>
-      </w:pPr>
-      <w:r>
-        <w:t>Department of Management Studies</w:t>
+        <w:t xml:space="preserve">Neha Bajaj </w:t>
       </w:r>
     </w:p>
     <w:p>

</xml_diff>